<commit_message>
fix: resume recent exp end date
</commit_message>
<xml_diff>
--- a/src/infrastructure/assets/documents/resume/resume.docx
+++ b/src/infrastructure/assets/documents/resume/resume.docx
@@ -390,17 +390,17 @@
         <w:tab/>
         <w:t xml:space="preserve">       </w:t>
         <w:tab/>
-        <w:t xml:space="preserve">       </w:t>
-      </w:r>
-      <w:r>
-        <w:rPr>
-          <w:rFonts w:ascii="EB Garamond" w:cs="EB Garamond" w:eastAsia="EB Garamond" w:hAnsi="EB Garamond"/>
-          <w:color w:val="434343"/>
-          <w:sz w:val="24"/>
-          <w:szCs w:val="24"/>
-          <w:rtl w:val="0"/>
-        </w:rPr>
-        <w:t xml:space="preserve">PDAX Inc, January 2026 - Present</w:t>
+        <w:t xml:space="preserve">   </w:t>
+      </w:r>
+      <w:r>
+        <w:rPr>
+          <w:rFonts w:ascii="EB Garamond" w:cs="EB Garamond" w:eastAsia="EB Garamond" w:hAnsi="EB Garamond"/>
+          <w:color w:val="434343"/>
+          <w:sz w:val="24"/>
+          <w:szCs w:val="24"/>
+          <w:rtl w:val="0"/>
+        </w:rPr>
+        <w:t xml:space="preserve">PDAX Inc, January 2026 - June 2026</w:t>
       </w:r>
       <w:r>
         <w:rPr>

</xml_diff>